<commit_message>
update format file (W726)
</commit_message>
<xml_diff>
--- a/formats/beat_generation_documentary_technological_anxiety_complete.docx
+++ b/formats/beat_generation_documentary_technological_anxiety_complete.docx
@@ -99,20 +99,7 @@
         <w:pStyle w:val="FirstParagraph"/>
       </w:pPr>
       <w:r>
-        <w:t xml:space="preserve">The rain on the skylight wasn’t water. It was data. A fine, particulate mist of it, beading and running in rivulets down the angled glass, each droplet a compressed packet of someone’s longing, someone’s purchase, someone’s half-formed thought snatched from the ether and sold for fractions of a cent. Leo watched it from the floor, his back against the cool plaster of the dead fireplace. He was trying to read a book. An actual book, its spine cracked like a dry riverbed, pages the color of weak tea. The words kept sliding away from him, replaced by the phantom buzz of notifications, the ghostly urge to check, to confirm, to</w:t>
-      </w:r>
-      <w:r>
-        <w:t xml:space="preserve"> </w:t>
-      </w:r>
-      <w:r>
-        <w:rPr>
-          <w:i/>
-          <w:iCs/>
-        </w:rPr>
-        <w:t xml:space="preserve">know</w:t>
-      </w:r>
-      <w:r>
-        <w:t xml:space="preserve">.</w:t>
+        <w:t xml:space="preserve">Kaufman’s camera whirred, a mechanical cicada in the dim San Francisco loft. It watched Ginsberg’s hands—not the poem, but the tremor as a news bulletin crackled from the Philco. Typewriter keys froze mid-strike. The machine was listening.</w:t>
       </w:r>
     </w:p>
     <w:p>

</xml_diff>